<commit_message>
dependency injection with keyed service and generic interface
</commit_message>
<xml_diff>
--- a/diagrams/DI_in_NET.docx
+++ b/diagrams/DI_in_NET.docx
@@ -3,6 +3,253 @@
 <w:document xmlns:wpc="http://schemas.microsoft.com/office/word/2010/wordprocessingCanvas" xmlns:cx="http://schemas.microsoft.com/office/drawing/2014/chartex" xmlns:cx1="http://schemas.microsoft.com/office/drawing/2015/9/8/chartex" xmlns:cx2="http://schemas.microsoft.com/office/drawing/2015/10/21/chartex" xmlns:cx3="http://schemas.microsoft.com/office/drawing/2016/5/9/chartex" xmlns:cx4="http://schemas.microsoft.com/office/drawing/2016/5/10/chartex" xmlns:cx5="http://schemas.microsoft.com/office/drawing/2016/5/11/chartex" xmlns:cx6="http://schemas.microsoft.com/office/drawing/2016/5/12/chartex" xmlns:cx7="http://schemas.microsoft.com/office/drawing/2016/5/13/chartex" xmlns:cx8="http://schemas.microsoft.com/office/drawing/2016/5/14/chartex" xmlns:mc="http://schemas.openxmlformats.org/markup-compatibility/2006" xmlns:aink="http://schemas.microsoft.com/office/drawing/2016/ink" xmlns:am3d="http://schemas.microsoft.com/office/drawing/2017/model3d" xmlns:o="urn:schemas-microsoft-com:office:office" xmlns:oel="http://schemas.microsoft.com/office/2019/extlst" xmlns:r="http://schemas.openxmlformats.org/officeDocument/2006/relationships" xmlns:m="http://schemas.openxmlformats.org/officeDocument/2006/math" xmlns:v="urn:schemas-microsoft-com:vml" xmlns:wp14="http://schemas.microsoft.com/office/word/2010/wordprocessingDrawing" xmlns:wp="http://schemas.openxmlformats.org/drawingml/2006/wordprocessingDrawing" xmlns:w10="urn:schemas-microsoft-com:office:word" xmlns:w="http://schemas.openxmlformats.org/wordprocessingml/2006/main" xmlns:w14="http://schemas.microsoft.com/office/word/2010/wordml" xmlns:w15="http://schemas.microsoft.com/office/word/2012/wordml" xmlns:w16cex="http://schemas.microsoft.com/office/word/2018/wordml/cex" xmlns:w16cid="http://schemas.microsoft.com/office/word/2016/wordml/cid" xmlns:w16="http://schemas.microsoft.com/office/word/2018/wordml" xmlns:w16du="http://schemas.microsoft.com/office/word/2023/wordml/word16du" xmlns:w16sdtdh="http://schemas.microsoft.com/office/word/2020/wordml/sdtdatahash" xmlns:w16sdtfl="http://schemas.microsoft.com/office/word/2024/wordml/sdtformatlock" xmlns:w16se="http://schemas.microsoft.com/office/word/2015/wordml/symex" xmlns:wpg="http://schemas.microsoft.com/office/word/2010/wordprocessingGroup" xmlns:wpi="http://schemas.microsoft.com/office/word/2010/wordprocessingInk" xmlns:wne="http://schemas.microsoft.com/office/word/2006/wordml" xmlns:wps="http://schemas.microsoft.com/office/word/2010/wordprocessingShape" mc:Ignorable="w14 w15 w16se w16cid w16 w16cex w16sdtdh w16sdtfl w16du wp14">
   <w:body>
     <w:p>
+      <w:r>
+        <w:rPr>
+          <w:noProof/>
+        </w:rPr>
+        <mc:AlternateContent>
+          <mc:Choice Requires="wps">
+            <w:drawing>
+              <wp:anchor distT="0" distB="0" distL="114300" distR="114300" simplePos="0" relativeHeight="251675648" behindDoc="0" locked="0" layoutInCell="1" allowOverlap="1" wp14:anchorId="54DE2DF1" wp14:editId="4386F56A">
+                <wp:simplePos x="0" y="0"/>
+                <wp:positionH relativeFrom="column">
+                  <wp:posOffset>1791858</wp:posOffset>
+                </wp:positionH>
+                <wp:positionV relativeFrom="paragraph">
+                  <wp:posOffset>1503904</wp:posOffset>
+                </wp:positionV>
+                <wp:extent cx="712694" cy="490332"/>
+                <wp:effectExtent l="0" t="0" r="11430" b="24130"/>
+                <wp:wrapNone/>
+                <wp:docPr id="326288160" name="Oval 17"/>
+                <wp:cNvGraphicFramePr/>
+                <a:graphic xmlns:a="http://schemas.openxmlformats.org/drawingml/2006/main">
+                  <a:graphicData uri="http://schemas.microsoft.com/office/word/2010/wordprocessingShape">
+                    <wps:wsp>
+                      <wps:cNvSpPr/>
+                      <wps:spPr>
+                        <a:xfrm>
+                          <a:off x="0" y="0"/>
+                          <a:ext cx="712694" cy="490332"/>
+                        </a:xfrm>
+                        <a:prstGeom prst="ellipse">
+                          <a:avLst/>
+                        </a:prstGeom>
+                        <a:solidFill>
+                          <a:schemeClr val="bg2">
+                            <a:lumMod val="25000"/>
+                          </a:schemeClr>
+                        </a:solidFill>
+                      </wps:spPr>
+                      <wps:style>
+                        <a:lnRef idx="2">
+                          <a:schemeClr val="accent1">
+                            <a:shade val="15000"/>
+                          </a:schemeClr>
+                        </a:lnRef>
+                        <a:fillRef idx="1">
+                          <a:schemeClr val="accent1"/>
+                        </a:fillRef>
+                        <a:effectRef idx="0">
+                          <a:schemeClr val="accent1"/>
+                        </a:effectRef>
+                        <a:fontRef idx="minor">
+                          <a:schemeClr val="lt1"/>
+                        </a:fontRef>
+                      </wps:style>
+                      <wps:txbx>
+                        <w:txbxContent>
+                          <w:p>
+                            <w:pPr>
+                              <w:jc w:val="center"/>
+                            </w:pPr>
+                            <w:r>
+                              <w:t>BO</w:t>
+                            </w:r>
+                          </w:p>
+                        </w:txbxContent>
+                      </wps:txbx>
+                      <wps:bodyPr rot="0" spcFirstLastPara="0" vertOverflow="overflow" horzOverflow="overflow" vert="horz" wrap="square" lIns="91440" tIns="45720" rIns="91440" bIns="45720" numCol="1" spcCol="0" rtlCol="0" fromWordArt="0" anchor="ctr" anchorCtr="0" forceAA="0" compatLnSpc="1">
+                        <a:prstTxWarp prst="textNoShape">
+                          <a:avLst/>
+                        </a:prstTxWarp>
+                        <a:noAutofit/>
+                      </wps:bodyPr>
+                    </wps:wsp>
+                  </a:graphicData>
+                </a:graphic>
+                <wp14:sizeRelH relativeFrom="margin">
+                  <wp14:pctWidth>0</wp14:pctWidth>
+                </wp14:sizeRelH>
+                <wp14:sizeRelV relativeFrom="margin">
+                  <wp14:pctHeight>0</wp14:pctHeight>
+                </wp14:sizeRelV>
+              </wp:anchor>
+            </w:drawing>
+          </mc:Choice>
+          <mc:Fallback>
+            <w:pict>
+              <v:oval w14:anchorId="54DE2DF1" id="Oval 17" o:spid="_x0000_s1026" style="position:absolute;margin-left:141.1pt;margin-top:118.4pt;width:56.1pt;height:38.6pt;z-index:251675648;visibility:visible;mso-wrap-style:square;mso-width-percent:0;mso-height-percent:0;mso-wrap-distance-left:9pt;mso-wrap-distance-top:0;mso-wrap-distance-right:9pt;mso-wrap-distance-bottom:0;mso-position-horizontal:absolute;mso-position-horizontal-relative:text;mso-position-vertical:absolute;mso-position-vertical-relative:text;mso-width-percent:0;mso-height-percent:0;mso-width-relative:margin;mso-height-relative:margin;v-text-anchor:middle" o:gfxdata="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" fillcolor="#393939 [814]" strokecolor="#030e13 [484]" strokeweight="1.5pt">
+                <v:stroke joinstyle="miter"/>
+                <v:textbox>
+                  <w:txbxContent>
+                    <w:p>
+                      <w:pPr>
+                        <w:jc w:val="center"/>
+                      </w:pPr>
+                      <w:r>
+                        <w:t>BO</w:t>
+                      </w:r>
+                    </w:p>
+                  </w:txbxContent>
+                </v:textbox>
+              </v:oval>
+            </w:pict>
+          </mc:Fallback>
+        </mc:AlternateContent>
+      </w:r>
+      <w:r>
+        <w:rPr>
+          <w:noProof/>
+        </w:rPr>
+        <mc:AlternateContent>
+          <mc:Choice Requires="wps">
+            <w:drawing>
+              <wp:anchor distT="0" distB="0" distL="114300" distR="114300" simplePos="0" relativeHeight="251665408" behindDoc="0" locked="0" layoutInCell="1" allowOverlap="1" wp14:anchorId="7DC4C1DD" wp14:editId="5F956E43">
+                <wp:simplePos x="0" y="0"/>
+                <wp:positionH relativeFrom="column">
+                  <wp:posOffset>1685365</wp:posOffset>
+                </wp:positionH>
+                <wp:positionV relativeFrom="paragraph">
+                  <wp:posOffset>1187824</wp:posOffset>
+                </wp:positionV>
+                <wp:extent cx="1868020" cy="891540"/>
+                <wp:effectExtent l="0" t="0" r="18415" b="22860"/>
+                <wp:wrapNone/>
+                <wp:docPr id="367683810" name="Flowchart: Magnetic Disk 7"/>
+                <wp:cNvGraphicFramePr/>
+                <a:graphic xmlns:a="http://schemas.openxmlformats.org/drawingml/2006/main">
+                  <a:graphicData uri="http://schemas.microsoft.com/office/word/2010/wordprocessingShape">
+                    <wps:wsp>
+                      <wps:cNvSpPr/>
+                      <wps:spPr>
+                        <a:xfrm>
+                          <a:off x="0" y="0"/>
+                          <a:ext cx="1868020" cy="891540"/>
+                        </a:xfrm>
+                        <a:prstGeom prst="flowChartMagneticDisk">
+                          <a:avLst/>
+                        </a:prstGeom>
+                      </wps:spPr>
+                      <wps:style>
+                        <a:lnRef idx="2">
+                          <a:schemeClr val="accent1">
+                            <a:shade val="15000"/>
+                          </a:schemeClr>
+                        </a:lnRef>
+                        <a:fillRef idx="1">
+                          <a:schemeClr val="accent1"/>
+                        </a:fillRef>
+                        <a:effectRef idx="0">
+                          <a:schemeClr val="accent1"/>
+                        </a:effectRef>
+                        <a:fontRef idx="minor">
+                          <a:schemeClr val="lt1"/>
+                        </a:fontRef>
+                      </wps:style>
+                      <wps:bodyPr rot="0" spcFirstLastPara="0" vertOverflow="overflow" horzOverflow="overflow" vert="horz" wrap="square" lIns="91440" tIns="45720" rIns="91440" bIns="45720" numCol="1" spcCol="0" rtlCol="0" fromWordArt="0" anchor="ctr" anchorCtr="0" forceAA="0" compatLnSpc="1">
+                        <a:prstTxWarp prst="textNoShape">
+                          <a:avLst/>
+                        </a:prstTxWarp>
+                        <a:noAutofit/>
+                      </wps:bodyPr>
+                    </wps:wsp>
+                  </a:graphicData>
+                </a:graphic>
+                <wp14:sizeRelH relativeFrom="margin">
+                  <wp14:pctWidth>0</wp14:pctWidth>
+                </wp14:sizeRelH>
+                <wp14:sizeRelV relativeFrom="margin">
+                  <wp14:pctHeight>0</wp14:pctHeight>
+                </wp14:sizeRelV>
+              </wp:anchor>
+            </w:drawing>
+          </mc:Choice>
+          <mc:Fallback>
+            <w:pict>
+              <v:shapetype w14:anchorId="0D29D93B" id="_x0000_t132" coordsize="21600,21600" o:spt="132" path="m10800,qx,3391l,18209qy10800,21600,21600,18209l21600,3391qy10800,xem,3391nfqy10800,6782,21600,3391e">
+                <v:path o:extrusionok="f" gradientshapeok="t" o:connecttype="custom" o:connectlocs="10800,6782;10800,0;0,10800;10800,21600;21600,10800" o:connectangles="270,270,180,90,0" textboxrect="0,6782,21600,18209"/>
+              </v:shapetype>
+              <v:shape id="Flowchart: Magnetic Disk 7" o:spid="_x0000_s1026" type="#_x0000_t132" style="position:absolute;margin-left:132.7pt;margin-top:93.55pt;width:147.1pt;height:70.2pt;z-index:251665408;visibility:visible;mso-wrap-style:square;mso-width-percent:0;mso-height-percent:0;mso-wrap-distance-left:9pt;mso-wrap-distance-top:0;mso-wrap-distance-right:9pt;mso-wrap-distance-bottom:0;mso-position-horizontal:absolute;mso-position-horizontal-relative:text;mso-position-vertical:absolute;mso-position-vertical-relative:text;mso-width-percent:0;mso-height-percent:0;mso-width-relative:margin;mso-height-relative:margin;v-text-anchor:middle" o:gfxdata="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" fillcolor="#156082 [3204]" strokecolor="#030e13 [484]" strokeweight="1.5pt">
+                <v:stroke joinstyle="miter"/>
+              </v:shape>
+            </w:pict>
+          </mc:Fallback>
+        </mc:AlternateContent>
+      </w:r>
+      <w:r>
+        <w:rPr>
+          <w:noProof/>
+        </w:rPr>
+        <mc:AlternateContent>
+          <mc:Choice Requires="wps">
+            <w:drawing>
+              <wp:anchor distT="0" distB="0" distL="114300" distR="114300" simplePos="0" relativeHeight="251663360" behindDoc="0" locked="0" layoutInCell="1" allowOverlap="1" wp14:anchorId="3207D24A" wp14:editId="0EB97D56">
+                <wp:simplePos x="0" y="0"/>
+                <wp:positionH relativeFrom="column">
+                  <wp:posOffset>5396641</wp:posOffset>
+                </wp:positionH>
+                <wp:positionV relativeFrom="paragraph">
+                  <wp:posOffset>1080135</wp:posOffset>
+                </wp:positionV>
+                <wp:extent cx="4482" cy="313802"/>
+                <wp:effectExtent l="0" t="0" r="33655" b="29210"/>
+                <wp:wrapNone/>
+                <wp:docPr id="1199750488" name="Straight Connector 5"/>
+                <wp:cNvGraphicFramePr/>
+                <a:graphic xmlns:a="http://schemas.openxmlformats.org/drawingml/2006/main">
+                  <a:graphicData uri="http://schemas.microsoft.com/office/word/2010/wordprocessingShape">
+                    <wps:wsp>
+                      <wps:cNvCnPr/>
+                      <wps:spPr>
+                        <a:xfrm>
+                          <a:off x="0" y="0"/>
+                          <a:ext cx="4482" cy="313802"/>
+                        </a:xfrm>
+                        <a:prstGeom prst="line">
+                          <a:avLst/>
+                        </a:prstGeom>
+                      </wps:spPr>
+                      <wps:style>
+                        <a:lnRef idx="2">
+                          <a:schemeClr val="accent1"/>
+                        </a:lnRef>
+                        <a:fillRef idx="0">
+                          <a:schemeClr val="accent1"/>
+                        </a:fillRef>
+                        <a:effectRef idx="1">
+                          <a:schemeClr val="accent1"/>
+                        </a:effectRef>
+                        <a:fontRef idx="minor">
+                          <a:schemeClr val="tx1"/>
+                        </a:fontRef>
+                      </wps:style>
+                      <wps:bodyPr/>
+                    </wps:wsp>
+                  </a:graphicData>
+                </a:graphic>
+              </wp:anchor>
+            </w:drawing>
+          </mc:Choice>
+          <mc:Fallback>
+            <w:pict>
+              <v:line w14:anchorId="1C50139F" id="Straight Connector 5" o:spid="_x0000_s1026" style="position:absolute;z-index:251663360;visibility:visible;mso-wrap-style:square;mso-wrap-distance-left:9pt;mso-wrap-distance-top:0;mso-wrap-distance-right:9pt;mso-wrap-distance-bottom:0;mso-position-horizontal:absolute;mso-position-horizontal-relative:text;mso-position-vertical:absolute;mso-position-vertical-relative:text" from="424.95pt,85.05pt" to="425.3pt,109.75pt" o:gfxdata="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" strokecolor="#156082 [3204]" strokeweight="1.5pt">
+                <v:stroke joinstyle="miter"/>
+              </v:line>
+            </w:pict>
+          </mc:Fallback>
+        </mc:AlternateContent>
+      </w:r>
       <w:r>
         <w:rPr>
           <w:noProof/>
@@ -75,7 +322,7 @@
                 <v:stroke joinstyle="miter"/>
                 <v:path gradientshapeok="t" o:connecttype="rect"/>
               </v:shapetype>
-              <v:shape id="Text Box 19" o:spid="_x0000_s1026" type="#_x0000_t202" style="position:absolute;margin-left:152.8pt;margin-top:163.7pt;width:119.3pt;height:27.2pt;z-index:251681792;visibility:visible;mso-wrap-style:square;mso-wrap-distance-left:9pt;mso-wrap-distance-top:0;mso-wrap-distance-right:9pt;mso-wrap-distance-bottom:0;mso-position-horizontal:absolute;mso-position-horizontal-relative:text;mso-position-vertical:absolute;mso-position-vertical-relative:text;v-text-anchor:top" o:gfxdata="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" fillcolor="white [3201]" strokeweight=".5pt">
+              <v:shape id="Text Box 19" o:spid="_x0000_s1027" type="#_x0000_t202" style="position:absolute;margin-left:152.8pt;margin-top:163.7pt;width:119.3pt;height:27.2pt;z-index:251681792;visibility:visible;mso-wrap-style:square;mso-wrap-distance-left:9pt;mso-wrap-distance-top:0;mso-wrap-distance-right:9pt;mso-wrap-distance-bottom:0;mso-position-horizontal:absolute;mso-position-horizontal-relative:text;mso-position-vertical:absolute;mso-position-vertical-relative:text;v-text-anchor:top" o:gfxdata="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" fillcolor="white [3201]" strokeweight=".5pt">
                 <v:textbox>
                   <w:txbxContent>
                     <w:p>
@@ -177,7 +424,7 @@
           </mc:Choice>
           <mc:Fallback>
             <w:pict>
-              <v:shape w14:anchorId="70EA854A" id="Text Box 2" o:spid="_x0000_s1027" type="#_x0000_t202" style="position:absolute;margin-left:284.8pt;margin-top:-44.45pt;width:223pt;height:42.35pt;z-index:251660288;visibility:visible;mso-wrap-style:square;mso-width-percent:0;mso-height-percent:0;mso-wrap-distance-left:9pt;mso-wrap-distance-top:0;mso-wrap-distance-right:9pt;mso-wrap-distance-bottom:0;mso-position-horizontal:absolute;mso-position-horizontal-relative:text;mso-position-vertical:absolute;mso-position-vertical-relative:text;mso-width-percent:0;mso-height-percent:0;mso-width-relative:margin;mso-height-relative:margin;v-text-anchor:top" o:gfxdata="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" fillcolor="white [3201]" strokeweight=".5pt">
+              <v:shape w14:anchorId="70EA854A" id="Text Box 2" o:spid="_x0000_s1028" type="#_x0000_t202" style="position:absolute;margin-left:284.8pt;margin-top:-44.45pt;width:223pt;height:42.35pt;z-index:251660288;visibility:visible;mso-wrap-style:square;mso-width-percent:0;mso-height-percent:0;mso-wrap-distance-left:9pt;mso-wrap-distance-top:0;mso-wrap-distance-right:9pt;mso-wrap-distance-bottom:0;mso-position-horizontal:absolute;mso-position-horizontal-relative:text;mso-position-vertical:absolute;mso-position-vertical-relative:text;mso-width-percent:0;mso-height-percent:0;mso-width-relative:margin;mso-height-relative:margin;v-text-anchor:top" o:gfxdata="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" fillcolor="white [3201]" strokeweight=".5pt">
                 <v:textbox>
                   <w:txbxContent>
                     <w:p>
@@ -282,7 +529,7 @@
           </mc:Choice>
           <mc:Fallback>
             <w:pict>
-              <v:shape w14:anchorId="558D54F5" id="Text Box 4" o:spid="_x0000_s1028" type="#_x0000_t202" style="position:absolute;margin-left:-15.2pt;margin-top:28.6pt;width:200.45pt;height:34.6pt;z-index:251680768;visibility:visible;mso-wrap-style:square;mso-wrap-distance-left:9pt;mso-wrap-distance-top:0;mso-wrap-distance-right:9pt;mso-wrap-distance-bottom:0;mso-position-horizontal:absolute;mso-position-horizontal-relative:text;mso-position-vertical:absolute;mso-position-vertical-relative:text;v-text-anchor:top" o:gfxdata="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" fillcolor="#4e95d9 [1631]" strokeweight=".5pt">
+              <v:shape w14:anchorId="558D54F5" id="Text Box 4" o:spid="_x0000_s1029" type="#_x0000_t202" style="position:absolute;margin-left:-15.2pt;margin-top:28.6pt;width:200.45pt;height:34.6pt;z-index:251680768;visibility:visible;mso-wrap-style:square;mso-wrap-distance-left:9pt;mso-wrap-distance-top:0;mso-wrap-distance-right:9pt;mso-wrap-distance-bottom:0;mso-position-horizontal:absolute;mso-position-horizontal-relative:text;mso-position-vertical:absolute;mso-position-vertical-relative:text;v-text-anchor:top" o:gfxdata="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" fillcolor="#4e95d9 [1631]" strokeweight=".5pt">
                 <v:textbox>
                   <w:txbxContent>
                     <w:p>
@@ -314,7 +561,7 @@
         <mc:AlternateContent>
           <mc:Choice Requires="wps">
             <w:drawing>
-              <wp:anchor distT="0" distB="0" distL="114300" distR="114300" simplePos="0" relativeHeight="251678720" behindDoc="0" locked="0" layoutInCell="1" allowOverlap="1" wp14:anchorId="5F836694" wp14:editId="2ACD3334">
+              <wp:anchor distT="0" distB="0" distL="114300" distR="114300" simplePos="0" relativeHeight="251678720" behindDoc="0" locked="0" layoutInCell="1" allowOverlap="1" wp14:anchorId="5F836694" wp14:editId="3D4F41FB">
                 <wp:simplePos x="0" y="0"/>
                 <wp:positionH relativeFrom="column">
                   <wp:posOffset>-345141</wp:posOffset>
@@ -384,7 +631,7 @@
           </mc:Choice>
           <mc:Fallback>
             <w:pict>
-              <v:shape w14:anchorId="5F836694" id="_x0000_s1029" type="#_x0000_t202" style="position:absolute;margin-left:-27.2pt;margin-top:16.6pt;width:200.45pt;height:34.6pt;z-index:251678720;visibility:visible;mso-wrap-style:square;mso-wrap-distance-left:9pt;mso-wrap-distance-top:0;mso-wrap-distance-right:9pt;mso-wrap-distance-bottom:0;mso-position-horizontal:absolute;mso-position-horizontal-relative:text;mso-position-vertical:absolute;mso-position-vertical-relative:text;v-text-anchor:top" o:gfxdata="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" fillcolor="#4e95d9 [1631]" strokeweight=".5pt">
+              <v:shape w14:anchorId="5F836694" id="_x0000_s1030" type="#_x0000_t202" style="position:absolute;margin-left:-27.2pt;margin-top:16.6pt;width:200.45pt;height:34.6pt;z-index:251678720;visibility:visible;mso-wrap-style:square;mso-wrap-distance-left:9pt;mso-wrap-distance-top:0;mso-wrap-distance-right:9pt;mso-wrap-distance-bottom:0;mso-position-horizontal:absolute;mso-position-horizontal-relative:text;mso-position-vertical:absolute;mso-position-vertical-relative:text;v-text-anchor:top" o:gfxdata="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" fillcolor="#4e95d9 [1631]" strokeweight=".5pt">
                 <v:textbox>
                   <w:txbxContent>
                     <w:p>
@@ -416,86 +663,7 @@
         <mc:AlternateContent>
           <mc:Choice Requires="wps">
             <w:drawing>
-              <wp:anchor distT="0" distB="0" distL="114300" distR="114300" simplePos="0" relativeHeight="251665408" behindDoc="0" locked="0" layoutInCell="1" allowOverlap="1" wp14:anchorId="7DC4C1DD" wp14:editId="1D3229EF">
-                <wp:simplePos x="0" y="0"/>
-                <wp:positionH relativeFrom="column">
-                  <wp:posOffset>1971675</wp:posOffset>
-                </wp:positionH>
-                <wp:positionV relativeFrom="paragraph">
-                  <wp:posOffset>1187450</wp:posOffset>
-                </wp:positionV>
-                <wp:extent cx="1581150" cy="891540"/>
-                <wp:effectExtent l="0" t="0" r="19050" b="22860"/>
-                <wp:wrapNone/>
-                <wp:docPr id="367683810" name="Flowchart: Magnetic Disk 7"/>
-                <wp:cNvGraphicFramePr/>
-                <a:graphic xmlns:a="http://schemas.openxmlformats.org/drawingml/2006/main">
-                  <a:graphicData uri="http://schemas.microsoft.com/office/word/2010/wordprocessingShape">
-                    <wps:wsp>
-                      <wps:cNvSpPr/>
-                      <wps:spPr>
-                        <a:xfrm>
-                          <a:off x="0" y="0"/>
-                          <a:ext cx="1581150" cy="891540"/>
-                        </a:xfrm>
-                        <a:prstGeom prst="flowChartMagneticDisk">
-                          <a:avLst/>
-                        </a:prstGeom>
-                      </wps:spPr>
-                      <wps:style>
-                        <a:lnRef idx="2">
-                          <a:schemeClr val="accent1">
-                            <a:shade val="15000"/>
-                          </a:schemeClr>
-                        </a:lnRef>
-                        <a:fillRef idx="1">
-                          <a:schemeClr val="accent1"/>
-                        </a:fillRef>
-                        <a:effectRef idx="0">
-                          <a:schemeClr val="accent1"/>
-                        </a:effectRef>
-                        <a:fontRef idx="minor">
-                          <a:schemeClr val="lt1"/>
-                        </a:fontRef>
-                      </wps:style>
-                      <wps:bodyPr rot="0" spcFirstLastPara="0" vertOverflow="overflow" horzOverflow="overflow" vert="horz" wrap="square" lIns="91440" tIns="45720" rIns="91440" bIns="45720" numCol="1" spcCol="0" rtlCol="0" fromWordArt="0" anchor="ctr" anchorCtr="0" forceAA="0" compatLnSpc="1">
-                        <a:prstTxWarp prst="textNoShape">
-                          <a:avLst/>
-                        </a:prstTxWarp>
-                        <a:noAutofit/>
-                      </wps:bodyPr>
-                    </wps:wsp>
-                  </a:graphicData>
-                </a:graphic>
-                <wp14:sizeRelH relativeFrom="margin">
-                  <wp14:pctWidth>0</wp14:pctWidth>
-                </wp14:sizeRelH>
-                <wp14:sizeRelV relativeFrom="margin">
-                  <wp14:pctHeight>0</wp14:pctHeight>
-                </wp14:sizeRelV>
-              </wp:anchor>
-            </w:drawing>
-          </mc:Choice>
-          <mc:Fallback>
-            <w:pict>
-              <v:shapetype w14:anchorId="2C813F19" id="_x0000_t132" coordsize="21600,21600" o:spt="132" path="m10800,qx,3391l,18209qy10800,21600,21600,18209l21600,3391qy10800,xem,3391nfqy10800,6782,21600,3391e">
-                <v:path o:extrusionok="f" gradientshapeok="t" o:connecttype="custom" o:connectlocs="10800,6782;10800,0;0,10800;10800,21600;21600,10800" o:connectangles="270,270,180,90,0" textboxrect="0,6782,21600,18209"/>
-              </v:shapetype>
-              <v:shape id="Flowchart: Magnetic Disk 7" o:spid="_x0000_s1026" type="#_x0000_t132" style="position:absolute;margin-left:155.25pt;margin-top:93.5pt;width:124.5pt;height:70.2pt;z-index:251665408;visibility:visible;mso-wrap-style:square;mso-width-percent:0;mso-height-percent:0;mso-wrap-distance-left:9pt;mso-wrap-distance-top:0;mso-wrap-distance-right:9pt;mso-wrap-distance-bottom:0;mso-position-horizontal:absolute;mso-position-horizontal-relative:text;mso-position-vertical:absolute;mso-position-vertical-relative:text;mso-width-percent:0;mso-height-percent:0;mso-width-relative:margin;mso-height-relative:margin;v-text-anchor:middle" o:gfxdata="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" fillcolor="#156082 [3204]" strokecolor="#030e13 [484]" strokeweight="1.5pt">
-                <v:stroke joinstyle="miter"/>
-              </v:shape>
-            </w:pict>
-          </mc:Fallback>
-        </mc:AlternateContent>
-      </w:r>
-      <w:r>
-        <w:rPr>
-          <w:noProof/>
-        </w:rPr>
-        <mc:AlternateContent>
-          <mc:Choice Requires="wps">
-            <w:drawing>
-              <wp:anchor distT="0" distB="0" distL="114300" distR="114300" simplePos="0" relativeHeight="251676672" behindDoc="0" locked="0" layoutInCell="1" allowOverlap="1" wp14:anchorId="6B20C218" wp14:editId="287F79B6">
+              <wp:anchor distT="0" distB="0" distL="114300" distR="114300" simplePos="0" relativeHeight="251676672" behindDoc="0" locked="0" layoutInCell="1" allowOverlap="1" wp14:anchorId="6B20C218" wp14:editId="5BFFD808">
                 <wp:simplePos x="0" y="0"/>
                 <wp:positionH relativeFrom="column">
                   <wp:posOffset>-304875</wp:posOffset>
@@ -555,7 +723,7 @@
           </mc:Choice>
           <mc:Fallback>
             <w:pict>
-              <v:shape w14:anchorId="6B20C218" id="Text Box 18" o:spid="_x0000_s1030" type="#_x0000_t202" style="position:absolute;margin-left:-24pt;margin-top:195.2pt;width:121.4pt;height:31.4pt;z-index:251676672;visibility:visible;mso-wrap-style:square;mso-width-percent:0;mso-wrap-distance-left:9pt;mso-wrap-distance-top:0;mso-wrap-distance-right:9pt;mso-wrap-distance-bottom:0;mso-position-horizontal:absolute;mso-position-horizontal-relative:text;mso-position-vertical:absolute;mso-position-vertical-relative:text;mso-width-percent:0;mso-width-relative:margin;v-text-anchor:top" o:gfxdata="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" fillcolor="white [3201]" strokeweight=".5pt">
+              <v:shape w14:anchorId="6B20C218" id="Text Box 18" o:spid="_x0000_s1031" type="#_x0000_t202" style="position:absolute;margin-left:-24pt;margin-top:195.2pt;width:121.4pt;height:31.4pt;z-index:251676672;visibility:visible;mso-wrap-style:square;mso-width-percent:0;mso-wrap-distance-left:9pt;mso-wrap-distance-top:0;mso-wrap-distance-right:9pt;mso-wrap-distance-bottom:0;mso-position-horizontal:absolute;mso-position-horizontal-relative:text;mso-position-vertical:absolute;mso-position-vertical-relative:text;mso-width-percent:0;mso-width-relative:margin;v-text-anchor:top" o:gfxdata="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" fillcolor="white [3201]" strokeweight=".5pt">
                 <v:textbox>
                   <w:txbxContent>
                     <w:p>
@@ -566,111 +734,6 @@
                   </w:txbxContent>
                 </v:textbox>
               </v:shape>
-            </w:pict>
-          </mc:Fallback>
-        </mc:AlternateContent>
-      </w:r>
-      <w:r>
-        <w:rPr>
-          <w:noProof/>
-        </w:rPr>
-        <mc:AlternateContent>
-          <mc:Choice Requires="wps">
-            <w:drawing>
-              <wp:anchor distT="0" distB="0" distL="114300" distR="114300" simplePos="0" relativeHeight="251675648" behindDoc="0" locked="0" layoutInCell="1" allowOverlap="1" wp14:anchorId="54DE2DF1" wp14:editId="3D6D0453">
-                <wp:simplePos x="0" y="0"/>
-                <wp:positionH relativeFrom="column">
-                  <wp:posOffset>2339302</wp:posOffset>
-                </wp:positionH>
-                <wp:positionV relativeFrom="paragraph">
-                  <wp:posOffset>1510255</wp:posOffset>
-                </wp:positionV>
-                <wp:extent cx="712694" cy="490332"/>
-                <wp:effectExtent l="0" t="0" r="11430" b="24130"/>
-                <wp:wrapNone/>
-                <wp:docPr id="326288160" name="Oval 17"/>
-                <wp:cNvGraphicFramePr/>
-                <a:graphic xmlns:a="http://schemas.openxmlformats.org/drawingml/2006/main">
-                  <a:graphicData uri="http://schemas.microsoft.com/office/word/2010/wordprocessingShape">
-                    <wps:wsp>
-                      <wps:cNvSpPr/>
-                      <wps:spPr>
-                        <a:xfrm>
-                          <a:off x="0" y="0"/>
-                          <a:ext cx="712694" cy="490332"/>
-                        </a:xfrm>
-                        <a:prstGeom prst="ellipse">
-                          <a:avLst/>
-                        </a:prstGeom>
-                        <a:solidFill>
-                          <a:schemeClr val="bg2">
-                            <a:lumMod val="25000"/>
-                          </a:schemeClr>
-                        </a:solidFill>
-                      </wps:spPr>
-                      <wps:style>
-                        <a:lnRef idx="2">
-                          <a:schemeClr val="accent1">
-                            <a:shade val="15000"/>
-                          </a:schemeClr>
-                        </a:lnRef>
-                        <a:fillRef idx="1">
-                          <a:schemeClr val="accent1"/>
-                        </a:fillRef>
-                        <a:effectRef idx="0">
-                          <a:schemeClr val="accent1"/>
-                        </a:effectRef>
-                        <a:fontRef idx="minor">
-                          <a:schemeClr val="lt1"/>
-                        </a:fontRef>
-                      </wps:style>
-                      <wps:txbx>
-                        <w:txbxContent>
-                          <w:p>
-                            <w:pPr>
-                              <w:jc w:val="center"/>
-                            </w:pPr>
-                            <w:r>
-                              <w:t>BO</w:t>
-                            </w:r>
-                          </w:p>
-                        </w:txbxContent>
-                      </wps:txbx>
-                      <wps:bodyPr rot="0" spcFirstLastPara="0" vertOverflow="overflow" horzOverflow="overflow" vert="horz" wrap="square" lIns="91440" tIns="45720" rIns="91440" bIns="45720" numCol="1" spcCol="0" rtlCol="0" fromWordArt="0" anchor="ctr" anchorCtr="0" forceAA="0" compatLnSpc="1">
-                        <a:prstTxWarp prst="textNoShape">
-                          <a:avLst/>
-                        </a:prstTxWarp>
-                        <a:noAutofit/>
-                      </wps:bodyPr>
-                    </wps:wsp>
-                  </a:graphicData>
-                </a:graphic>
-                <wp14:sizeRelH relativeFrom="margin">
-                  <wp14:pctWidth>0</wp14:pctWidth>
-                </wp14:sizeRelH>
-                <wp14:sizeRelV relativeFrom="margin">
-                  <wp14:pctHeight>0</wp14:pctHeight>
-                </wp14:sizeRelV>
-              </wp:anchor>
-            </w:drawing>
-          </mc:Choice>
-          <mc:Fallback>
-            <w:pict>
-              <v:oval w14:anchorId="54DE2DF1" id="Oval 17" o:spid="_x0000_s1031" style="position:absolute;margin-left:184.2pt;margin-top:118.9pt;width:56.1pt;height:38.6pt;z-index:251675648;visibility:visible;mso-wrap-style:square;mso-width-percent:0;mso-height-percent:0;mso-wrap-distance-left:9pt;mso-wrap-distance-top:0;mso-wrap-distance-right:9pt;mso-wrap-distance-bottom:0;mso-position-horizontal:absolute;mso-position-horizontal-relative:text;mso-position-vertical:absolute;mso-position-vertical-relative:text;mso-width-percent:0;mso-height-percent:0;mso-width-relative:margin;mso-height-relative:margin;v-text-anchor:middle" o:gfxdata="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" fillcolor="#393939 [814]" strokecolor="#030e13 [484]" strokeweight="1.5pt">
-                <v:stroke joinstyle="miter"/>
-                <v:textbox>
-                  <w:txbxContent>
-                    <w:p>
-                      <w:pPr>
-                        <w:jc w:val="center"/>
-                      </w:pPr>
-                      <w:r>
-                        <w:t>BO</w:t>
-                      </w:r>
-                    </w:p>
-                  </w:txbxContent>
-                </v:textbox>
-              </v:oval>
             </w:pict>
           </mc:Fallback>
         </mc:AlternateContent>
@@ -734,7 +797,7 @@
           </mc:Choice>
           <mc:Fallback>
             <w:pict>
-              <v:shapetype w14:anchorId="7B3E6E5B" id="_x0000_t32" coordsize="21600,21600" o:spt="32" o:oned="t" path="m,l21600,21600e" filled="f">
+              <v:shapetype w14:anchorId="66E3B52A" id="_x0000_t32" coordsize="21600,21600" o:spt="32" o:oned="t" path="m,l21600,21600e" filled="f">
                 <v:path arrowok="t" fillok="f" o:connecttype="none"/>
                 <o:lock v:ext="edit" shapetype="t"/>
               </v:shapetype>
@@ -810,7 +873,7 @@
           </mc:Choice>
           <mc:Fallback>
             <w:pict>
-              <v:shape w14:anchorId="5504D807" id="Straight Arrow Connector 3" o:spid="_x0000_s1026" type="#_x0000_t32" style="position:absolute;margin-left:163.75pt;margin-top:16.9pt;width:121.05pt;height:3.6pt;flip:y;z-index:251661312;visibility:visible;mso-wrap-style:square;mso-width-percent:0;mso-height-percent:0;mso-wrap-distance-left:9pt;mso-wrap-distance-top:0;mso-wrap-distance-right:9pt;mso-wrap-distance-bottom:0;mso-position-horizontal:absolute;mso-position-horizontal-relative:text;mso-position-vertical:absolute;mso-position-vertical-relative:text;mso-width-percent:0;mso-height-percent:0;mso-width-relative:margin;mso-height-relative:margin" o:gfxdata="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" strokecolor="#156082 [3204]" strokeweight="1.5pt">
+              <v:shape w14:anchorId="045B324D" id="Straight Arrow Connector 3" o:spid="_x0000_s1026" type="#_x0000_t32" style="position:absolute;margin-left:163.75pt;margin-top:16.9pt;width:121.05pt;height:3.6pt;flip:y;z-index:251661312;visibility:visible;mso-wrap-style:square;mso-width-percent:0;mso-height-percent:0;mso-wrap-distance-left:9pt;mso-wrap-distance-top:0;mso-wrap-distance-right:9pt;mso-wrap-distance-bottom:0;mso-position-horizontal:absolute;mso-position-horizontal-relative:text;mso-position-vertical:absolute;mso-position-vertical-relative:text;mso-width-percent:0;mso-height-percent:0;mso-width-relative:margin;mso-height-relative:margin" o:gfxdata="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" strokecolor="#156082 [3204]" strokeweight="1.5pt">
                 <v:stroke endarrow="block" joinstyle="miter"/>
               </v:shape>
             </w:pict>
@@ -997,7 +1060,7 @@
           </mc:Choice>
           <mc:Fallback>
             <w:pict>
-              <v:shape w14:anchorId="630FB632" id="Straight Arrow Connector 15" o:spid="_x0000_s1026" type="#_x0000_t32" style="position:absolute;margin-left:37.05pt;margin-top:157.05pt;width:.35pt;height:34.95pt;z-index:251673600;visibility:visible;mso-wrap-style:square;mso-wrap-distance-left:9pt;mso-wrap-distance-top:0;mso-wrap-distance-right:9pt;mso-wrap-distance-bottom:0;mso-position-horizontal:absolute;mso-position-horizontal-relative:text;mso-position-vertical:absolute;mso-position-vertical-relative:text" o:gfxdata="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" strokecolor="#156082 [3204]" strokeweight="1.5pt">
+              <v:shape w14:anchorId="0CF2598F" id="Straight Arrow Connector 15" o:spid="_x0000_s1026" type="#_x0000_t32" style="position:absolute;margin-left:37.05pt;margin-top:157.05pt;width:.35pt;height:34.95pt;z-index:251673600;visibility:visible;mso-wrap-style:square;mso-wrap-distance-left:9pt;mso-wrap-distance-top:0;mso-wrap-distance-right:9pt;mso-wrap-distance-bottom:0;mso-position-horizontal:absolute;mso-position-horizontal-relative:text;mso-position-vertical:absolute;mso-position-vertical-relative:text" o:gfxdata="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" strokecolor="#156082 [3204]" strokeweight="1.5pt">
                 <v:stroke endarrow="block" joinstyle="miter"/>
               </v:shape>
             </w:pict>
@@ -1060,7 +1123,7 @@
           </mc:Choice>
           <mc:Fallback>
             <w:pict>
-              <v:line w14:anchorId="642EAFE8" id="Straight Connector 14" o:spid="_x0000_s1026" style="position:absolute;flip:x;z-index:251672576;visibility:visible;mso-wrap-style:square;mso-wrap-distance-left:9pt;mso-wrap-distance-top:0;mso-wrap-distance-right:9pt;mso-wrap-distance-bottom:0;mso-position-horizontal:absolute;mso-position-horizontal-relative:text;mso-position-vertical:absolute;mso-position-vertical-relative:text" from="110.45pt,137.3pt" to="158.45pt,137.3pt" o:gfxdata="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" strokecolor="#156082 [3204]" strokeweight="1.5pt">
+              <v:line w14:anchorId="695B6130" id="Straight Connector 14" o:spid="_x0000_s1026" style="position:absolute;flip:x;z-index:251672576;visibility:visible;mso-wrap-style:square;mso-wrap-distance-left:9pt;mso-wrap-distance-top:0;mso-wrap-distance-right:9pt;mso-wrap-distance-bottom:0;mso-position-horizontal:absolute;mso-position-horizontal-relative:text;mso-position-vertical:absolute;mso-position-vertical-relative:text" from="110.45pt,137.3pt" to="158.45pt,137.3pt" o:gfxdata="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" strokecolor="#156082 [3204]" strokeweight="1.5pt">
                 <v:stroke joinstyle="miter"/>
               </v:line>
             </w:pict>
@@ -1129,7 +1192,7 @@
           </mc:Choice>
           <mc:Fallback>
             <w:pict>
-              <v:shape w14:anchorId="25A9A76F" id="Straight Arrow Connector 12" o:spid="_x0000_s1026" type="#_x0000_t32" style="position:absolute;margin-left:282.7pt;margin-top:155.65pt;width:22.6pt;height:12.35pt;flip:x y;z-index:251670528;visibility:visible;mso-wrap-style:square;mso-wrap-distance-left:9pt;mso-wrap-distance-top:0;mso-wrap-distance-right:9pt;mso-wrap-distance-bottom:0;mso-position-horizontal:absolute;mso-position-horizontal-relative:text;mso-position-vertical:absolute;mso-position-vertical-relative:text" o:gfxdata="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" strokecolor="#ffc000" strokeweight="1.5pt">
+              <v:shape w14:anchorId="240D142F" id="Straight Arrow Connector 12" o:spid="_x0000_s1026" type="#_x0000_t32" style="position:absolute;margin-left:282.7pt;margin-top:155.65pt;width:22.6pt;height:12.35pt;flip:x y;z-index:251670528;visibility:visible;mso-wrap-style:square;mso-wrap-distance-left:9pt;mso-wrap-distance-top:0;mso-wrap-distance-right:9pt;mso-wrap-distance-bottom:0;mso-position-horizontal:absolute;mso-position-horizontal-relative:text;mso-position-vertical:absolute;mso-position-vertical-relative:text" o:gfxdata="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" strokecolor="#ffc000" strokeweight="1.5pt">
                 <v:stroke endarrow="block" joinstyle="miter"/>
               </v:shape>
             </w:pict>
@@ -1305,7 +1368,7 @@
           </mc:Choice>
           <mc:Fallback>
             <w:pict>
-              <v:rect w14:anchorId="576F0862" id="Rectangle 1" o:spid="_x0000_s1026" style="position:absolute;margin-left:286.6pt;margin-top:-17.3pt;width:219.85pt;height:102.35pt;z-index:251659264;visibility:visible;mso-wrap-style:square;mso-width-percent:0;mso-height-percent:0;mso-wrap-distance-left:9pt;mso-wrap-distance-top:0;mso-wrap-distance-right:9pt;mso-wrap-distance-bottom:0;mso-position-horizontal:absolute;mso-position-horizontal-relative:text;mso-position-vertical:absolute;mso-position-vertical-relative:text;mso-width-percent:0;mso-height-percent:0;mso-width-relative:margin;mso-height-relative:margin;v-text-anchor:middle" o:gfxdata="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" fillcolor="#f1a983 [1941]" strokecolor="#030e13 [484]" strokeweight="1.5pt"/>
+              <v:rect w14:anchorId="19503F67" id="Rectangle 1" o:spid="_x0000_s1026" style="position:absolute;margin-left:286.6pt;margin-top:-17.3pt;width:219.85pt;height:102.35pt;z-index:251659264;visibility:visible;mso-wrap-style:square;mso-width-percent:0;mso-height-percent:0;mso-wrap-distance-left:9pt;mso-wrap-distance-top:0;mso-wrap-distance-right:9pt;mso-wrap-distance-bottom:0;mso-position-horizontal:absolute;mso-position-horizontal-relative:text;mso-position-vertical:absolute;mso-position-vertical-relative:text;mso-width-percent:0;mso-height-percent:0;mso-width-relative:margin;mso-height-relative:margin;v-text-anchor:middle" o:gfxdata="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" fillcolor="#f1a983 [1941]" strokecolor="#030e13 [484]" strokeweight="1.5pt"/>
             </w:pict>
           </mc:Fallback>
         </mc:AlternateContent>
@@ -1716,7 +1779,7 @@
         <mc:AlternateContent>
           <mc:Choice Requires="wps">
             <w:drawing>
-              <wp:anchor distT="0" distB="0" distL="114300" distR="114300" simplePos="0" relativeHeight="251664384" behindDoc="0" locked="0" layoutInCell="1" allowOverlap="1" wp14:anchorId="128CD326" wp14:editId="25FDD057">
+              <wp:anchor distT="0" distB="0" distL="114300" distR="114300" simplePos="0" relativeHeight="251664384" behindDoc="0" locked="0" layoutInCell="1" allowOverlap="1" wp14:anchorId="128CD326" wp14:editId="2ED70AE4">
                 <wp:simplePos x="0" y="0"/>
                 <wp:positionH relativeFrom="column">
                   <wp:posOffset>3688976</wp:posOffset>
@@ -1768,72 +1831,9 @@
           </mc:Choice>
           <mc:Fallback>
             <w:pict>
-              <v:shape w14:anchorId="3C092526" id="Straight Arrow Connector 6" o:spid="_x0000_s1026" type="#_x0000_t32" style="position:absolute;margin-left:290.45pt;margin-top:111.9pt;width:135.9pt;height:0;flip:x;z-index:251664384;visibility:visible;mso-wrap-style:square;mso-wrap-distance-left:9pt;mso-wrap-distance-top:0;mso-wrap-distance-right:9pt;mso-wrap-distance-bottom:0;mso-position-horizontal:absolute;mso-position-horizontal-relative:text;mso-position-vertical:absolute;mso-position-vertical-relative:text" o:gfxdata="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" strokecolor="#156082 [3204]" strokeweight="1.5pt">
+              <v:shape w14:anchorId="1DFC29D9" id="Straight Arrow Connector 6" o:spid="_x0000_s1026" type="#_x0000_t32" style="position:absolute;margin-left:290.45pt;margin-top:111.9pt;width:135.9pt;height:0;flip:x;z-index:251664384;visibility:visible;mso-wrap-style:square;mso-wrap-distance-left:9pt;mso-wrap-distance-top:0;mso-wrap-distance-right:9pt;mso-wrap-distance-bottom:0;mso-position-horizontal:absolute;mso-position-horizontal-relative:text;mso-position-vertical:absolute;mso-position-vertical-relative:text" o:gfxdata="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" strokecolor="#156082 [3204]" strokeweight="1.5pt">
                 <v:stroke endarrow="block" joinstyle="miter"/>
               </v:shape>
-            </w:pict>
-          </mc:Fallback>
-        </mc:AlternateContent>
-      </w:r>
-      <w:r>
-        <w:rPr>
-          <w:noProof/>
-        </w:rPr>
-        <mc:AlternateContent>
-          <mc:Choice Requires="wps">
-            <w:drawing>
-              <wp:anchor distT="0" distB="0" distL="114300" distR="114300" simplePos="0" relativeHeight="251663360" behindDoc="0" locked="0" layoutInCell="1" allowOverlap="1" wp14:anchorId="3207D24A" wp14:editId="1A398CBA">
-                <wp:simplePos x="0" y="0"/>
-                <wp:positionH relativeFrom="column">
-                  <wp:posOffset>5423647</wp:posOffset>
-                </wp:positionH>
-                <wp:positionV relativeFrom="paragraph">
-                  <wp:posOffset>1080210</wp:posOffset>
-                </wp:positionV>
-                <wp:extent cx="4482" cy="313802"/>
-                <wp:effectExtent l="0" t="0" r="33655" b="29210"/>
-                <wp:wrapNone/>
-                <wp:docPr id="1199750488" name="Straight Connector 5"/>
-                <wp:cNvGraphicFramePr/>
-                <a:graphic xmlns:a="http://schemas.openxmlformats.org/drawingml/2006/main">
-                  <a:graphicData uri="http://schemas.microsoft.com/office/word/2010/wordprocessingShape">
-                    <wps:wsp>
-                      <wps:cNvCnPr/>
-                      <wps:spPr>
-                        <a:xfrm>
-                          <a:off x="0" y="0"/>
-                          <a:ext cx="4482" cy="313802"/>
-                        </a:xfrm>
-                        <a:prstGeom prst="line">
-                          <a:avLst/>
-                        </a:prstGeom>
-                      </wps:spPr>
-                      <wps:style>
-                        <a:lnRef idx="2">
-                          <a:schemeClr val="accent1"/>
-                        </a:lnRef>
-                        <a:fillRef idx="0">
-                          <a:schemeClr val="accent1"/>
-                        </a:fillRef>
-                        <a:effectRef idx="1">
-                          <a:schemeClr val="accent1"/>
-                        </a:effectRef>
-                        <a:fontRef idx="minor">
-                          <a:schemeClr val="tx1"/>
-                        </a:fontRef>
-                      </wps:style>
-                      <wps:bodyPr/>
-                    </wps:wsp>
-                  </a:graphicData>
-                </a:graphic>
-              </wp:anchor>
-            </w:drawing>
-          </mc:Choice>
-          <mc:Fallback>
-            <w:pict>
-              <v:line w14:anchorId="19F879D1" id="Straight Connector 5" o:spid="_x0000_s1026" style="position:absolute;z-index:251663360;visibility:visible;mso-wrap-style:square;mso-wrap-distance-left:9pt;mso-wrap-distance-top:0;mso-wrap-distance-right:9pt;mso-wrap-distance-bottom:0;mso-position-horizontal:absolute;mso-position-horizontal-relative:text;mso-position-vertical:absolute;mso-position-vertical-relative:text" from="427.05pt,85.05pt" to="427.4pt,109.75pt" o:gfxdata="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" strokecolor="#156082 [3204]" strokeweight="1.5pt">
-                <v:stroke joinstyle="miter"/>
-              </v:line>
             </w:pict>
           </mc:Fallback>
         </mc:AlternateContent>

</xml_diff>